<commit_message>
Expand Aleria Arcana character coverage and fix text ligatures
</commit_message>
<xml_diff>
--- a/Fonts/Arkanes-Alphabet/Arkanes-Alphabet-Handbuch.docx
+++ b/Fonts/Arkanes-Alphabet/Arkanes-Alphabet-Handbuch.docx
@@ -4407,7 +4407,7 @@
     </w:p>
     <w:p>
       <w:r>
-        <w:t>Der gerade und der typografische Apostroph stehen beide für Ón. Das Ausrufezeichen steht für Xhael, Æ und æ zusätzlich für Aetha. Ein normales Satzende mit ! muss außerhalb des arcane-Elements stehen. J, K, Q, W und deutsche Umlaute gehören nicht zum festgelegten Alphabet; sie werden nicht automatisch umgedeutet. Für den Laut k ist das Zeichen C vorgesehen. Ziffern und übrige Satzzeichen verwenden die Ersatzschrift.</w:t>
+        <w:t>Version 3 ergänzt J, K, Q, W, Umlaute, ß, ẞ, Ziffern und Satzzeichen. K/k verwendet wie C/c die Rune Coll. Im bisherigen Runenmodus arcane stehen Apostrophe weiterhin für Ón und ! für Xhael. Für deutsche Texte dient die Klasse arcane-text: Sie bewahrt normale Satzzeichen und zeigt jeden Buchstaben einzeln. Æ und æ verwenden Aetha.</w:t>
       </w:r>
     </w:p>
     <w:p>
@@ -4425,7 +4425,312 @@
     </w:p>
     <w:p>
       <w:r>
-        <w:t>Die Schriftfassung Alte Ritualrunen übernimmt die zwölf großen Zeichen aus Entwurf III in Lesereihenfolge für A bis N; 21 passende Zeichen ergänzen das Alphabet. Spiralen, Augenformen und spitz auslaufende Schwünge bleiben erhalten. Papierstruktur entfällt im Font; goldene Punkte werden Teil der einfarbigen Kontur. Alle Glyphen folgen der CSS-Textfarbe. Bearbeitbare SVG-Dateien liegen in source/glyphs; source/build_font.py erzeugt daraus die Schriftdateien.</w:t>
+        <w:t>Die 33 Lore-Runen aus der Schriftfassung Alte Ritualrunen bleiben erhalten. Die Schreibergänzungen für deutsche Texte folgen denselben spitz auslaufenden Konturen. Umlaute tragen zwei Rautenpunkte. Alle Glyphen folgen der CSS-Textfarbe. source/glyphs enthält die freigegebenen Grundformen; source/compatibility.py definiert die Ergänzungen. source/build_font.py erzeugt beide Schriftfamilien.</w:t>
+      </w:r>
+    </w:p>
+    <w:p>
+      <w:r>
+        <w:br w:type="page"/>
+      </w:r>
+    </w:p>
+    <w:p>
+      <w:pPr>
+        <w:pStyle w:val="Heading1"/>
+      </w:pPr>
+      <w:r>
+        <w:t>Erweiterter Zeichensatz für deutsche Texte</w:t>
+      </w:r>
+    </w:p>
+    <w:p>
+      <w:r>
+        <w:t>Die Erweiterung schließt die Lücken für gewöhnliche deutsche Texte. Sie ergänzt die technische Schriftdatei; die 33 überlieferten Runen und ihre magischen Zahlenwerte bleiben unverändert.</w:t>
+      </w:r>
+    </w:p>
+    <w:tbl>
+      <w:tblPr>
+        <w:tblW w:type="auto" w:w="0"/>
+        <w:tblLayout w:type="fixed"/>
+        <w:tblLook w:firstColumn="1" w:firstRow="1" w:lastColumn="0" w:lastRow="0" w:noHBand="0" w:noVBand="1" w:val="04A0"/>
+      </w:tblPr>
+      <w:tblGrid>
+        <w:gridCol w:w="2268"/>
+        <w:gridCol w:w="7370"/>
+      </w:tblGrid>
+      <w:tr>
+        <w:tc>
+          <w:tcPr>
+            <w:tcW w:type="dxa" w:w="4933"/>
+            <w:shd w:fill="E4EADD"/>
+          </w:tcPr>
+          <w:p>
+            <w:r>
+              <w:t>Bereich</w:t>
+            </w:r>
+          </w:p>
+        </w:tc>
+        <w:tc>
+          <w:tcPr>
+            <w:tcW w:type="dxa" w:w="4933"/>
+            <w:shd w:fill="E4EADD"/>
+          </w:tcPr>
+          <w:p>
+            <w:r>
+              <w:t>Unterstützte Zeichen</w:t>
+            </w:r>
+          </w:p>
+        </w:tc>
+      </w:tr>
+      <w:tr>
+        <w:tc>
+          <w:tcPr>
+            <w:tcW w:type="dxa" w:w="2268"/>
+          </w:tcPr>
+          <w:p>
+            <w:pPr>
+              <w:spacing w:after="120"/>
+            </w:pPr>
+            <w:r>
+              <w:rPr>
+                <w:sz w:val="20"/>
+              </w:rPr>
+              <w:t>Grundalphabet</w:t>
+            </w:r>
+          </w:p>
+        </w:tc>
+        <w:tc>
+          <w:tcPr>
+            <w:tcW w:type="dxa" w:w="7370"/>
+          </w:tcPr>
+          <w:p>
+            <w:pPr>
+              <w:spacing w:after="120"/>
+            </w:pPr>
+            <w:r>
+              <w:rPr>
+                <w:sz w:val="20"/>
+              </w:rPr>
+              <w:t>A bis Z und a bis z, einschließlich J, K, Q und W</w:t>
+            </w:r>
+          </w:p>
+        </w:tc>
+      </w:tr>
+      <w:tr>
+        <w:tc>
+          <w:tcPr>
+            <w:tcW w:type="dxa" w:w="2268"/>
+          </w:tcPr>
+          <w:p>
+            <w:pPr>
+              <w:spacing w:after="120"/>
+            </w:pPr>
+            <w:r>
+              <w:rPr>
+                <w:sz w:val="20"/>
+              </w:rPr>
+              <w:t>Deutsch</w:t>
+            </w:r>
+          </w:p>
+        </w:tc>
+        <w:tc>
+          <w:tcPr>
+            <w:tcW w:type="dxa" w:w="7370"/>
+          </w:tcPr>
+          <w:p>
+            <w:pPr>
+              <w:spacing w:after="120"/>
+            </w:pPr>
+            <w:r>
+              <w:rPr>
+                <w:sz w:val="20"/>
+              </w:rPr>
+              <w:t>Ä Ö Ü ä ö ü ß ẞ</w:t>
+            </w:r>
+          </w:p>
+        </w:tc>
+      </w:tr>
+      <w:tr>
+        <w:tc>
+          <w:tcPr>
+            <w:tcW w:type="dxa" w:w="2268"/>
+          </w:tcPr>
+          <w:p>
+            <w:pPr>
+              <w:spacing w:after="120"/>
+            </w:pPr>
+            <w:r>
+              <w:rPr>
+                <w:sz w:val="20"/>
+              </w:rPr>
+              <w:t>Ziffern</w:t>
+            </w:r>
+          </w:p>
+        </w:tc>
+        <w:tc>
+          <w:tcPr>
+            <w:tcW w:type="dxa" w:w="7370"/>
+          </w:tcPr>
+          <w:p>
+            <w:pPr>
+              <w:spacing w:after="120"/>
+            </w:pPr>
+            <w:r>
+              <w:rPr>
+                <w:sz w:val="20"/>
+              </w:rPr>
+              <w:t>0 1 2 3 4 5 6 7 8 9</w:t>
+            </w:r>
+          </w:p>
+        </w:tc>
+      </w:tr>
+      <w:tr>
+        <w:tc>
+          <w:tcPr>
+            <w:tcW w:type="dxa" w:w="2268"/>
+          </w:tcPr>
+          <w:p>
+            <w:pPr>
+              <w:spacing w:after="120"/>
+            </w:pPr>
+            <w:r>
+              <w:rPr>
+                <w:sz w:val="20"/>
+              </w:rPr>
+              <w:t>Akzente</w:t>
+            </w:r>
+          </w:p>
+        </w:tc>
+        <w:tc>
+          <w:tcPr>
+            <w:tcW w:type="dxa" w:w="7370"/>
+          </w:tcPr>
+          <w:p>
+            <w:pPr>
+              <w:spacing w:after="120"/>
+            </w:pPr>
+            <w:r>
+              <w:rPr>
+                <w:sz w:val="20"/>
+              </w:rPr>
+              <w:t>Druckbare Latin-1-Zeichen und Latin Extended-A, etwa á é í ó ú à è ç ñ Ğ İ ı Ş Ł</w:t>
+            </w:r>
+          </w:p>
+        </w:tc>
+      </w:tr>
+      <w:tr>
+        <w:tc>
+          <w:tcPr>
+            <w:tcW w:type="dxa" w:w="2268"/>
+          </w:tcPr>
+          <w:p>
+            <w:pPr>
+              <w:spacing w:after="120"/>
+            </w:pPr>
+            <w:r>
+              <w:rPr>
+                <w:sz w:val="20"/>
+              </w:rPr>
+              <w:t>Satzzeichen</w:t>
+            </w:r>
+          </w:p>
+        </w:tc>
+        <w:tc>
+          <w:tcPr>
+            <w:tcW w:type="dxa" w:w="7370"/>
+          </w:tcPr>
+          <w:p>
+            <w:pPr>
+              <w:spacing w:after="120"/>
+            </w:pPr>
+            <w:r>
+              <w:rPr>
+                <w:sz w:val="20"/>
+              </w:rPr>
+              <w:t>ASCII-Satzzeichen sowie „ “ ” ‚ ‘ ’ « » ‹ › … – und weitere typografische Zeichen</w:t>
+            </w:r>
+          </w:p>
+        </w:tc>
+      </w:tr>
+      <w:tr>
+        <w:tc>
+          <w:tcPr>
+            <w:tcW w:type="dxa" w:w="2268"/>
+          </w:tcPr>
+          <w:p>
+            <w:pPr>
+              <w:spacing w:after="120"/>
+            </w:pPr>
+            <w:r>
+              <w:rPr>
+                <w:sz w:val="20"/>
+              </w:rPr>
+              <w:t>Weitere Zeichen</w:t>
+            </w:r>
+          </w:p>
+        </w:tc>
+        <w:tc>
+          <w:tcPr>
+            <w:tcW w:type="dxa" w:w="7370"/>
+          </w:tcPr>
+          <w:p>
+            <w:pPr>
+              <w:spacing w:after="120"/>
+            </w:pPr>
+            <w:r>
+              <w:rPr>
+                <w:sz w:val="20"/>
+              </w:rPr>
+              <w:t>€ £ ¥ ¢ © ® ™ § ¶ ° ± × ÷ ¼ ½ ¾ und übliche geschützte Leerzeichen</w:t>
+            </w:r>
+          </w:p>
+        </w:tc>
+      </w:tr>
+    </w:tbl>
+    <w:p>
+      <w:pPr>
+        <w:pStyle w:val="Heading2"/>
+      </w:pPr>
+      <w:r>
+        <w:t>Welche Schriftvariante verwenden</w:t>
+      </w:r>
+    </w:p>
+    <w:p>
+      <w:r>
+        <w:t>Für Fließtexte und Namen ist arcane-text vorgesehen. Die zusätzliche Familie Aleria Arcana Text verwendet normale Satzzeichen und unterdrückt Doppelzeichen-Ligaturen. Für bestehende Zauberformeln bleibt arcane erhalten: CH, SH und die weiteren Doppelzeichen werden verbunden, ! und Apostrophe rufen Xhael und Ón auf.</w:t>
+      </w:r>
+    </w:p>
+    <w:p>
+      <w:r>
+        <w:rPr>
+          <w:rFonts w:ascii="Consolas" w:hAnsi="Consolas"/>
+          <w:sz w:val="20"/>
+        </w:rPr>
+        <w:t>&lt;p class="arcane-text"&gt;König Kök grüßt zwölf Jäger.&lt;/p&gt;</w:t>
+      </w:r>
+    </w:p>
+    <w:p>
+      <w:pPr>
+        <w:pStyle w:val="Heading2"/>
+      </w:pPr>
+      <w:r>
+        <w:t>K und die Bedeutung der Ergänzungen</w:t>
+      </w:r>
+    </w:p>
+    <w:p>
+      <w:r>
+        <w:t>Coll trägt bereits den Laut k. Deshalb zeigen C und K dieselbe Rune. J, Q, W und ß erhalten passende Ergänzungsformen; Ä, Ö und Ü entstehen aus der jeweiligen Grundrune mit zwei Rautenpunkten. Diese Schreibzeichen erhalten keine erfundenen magischen Bedeutungen oder Zahlenwerte.</w:t>
+      </w:r>
+    </w:p>
+    <w:p>
+      <w:pPr>
+        <w:pStyle w:val="Heading2"/>
+      </w:pPr>
+      <w:r>
+        <w:t>Vorhandene Einbindung aktualisieren</w:t>
+      </w:r>
+    </w:p>
+    <w:p>
+      <w:r>
+        <w:t>Die alten CSS- und Fontdateien durch dieses Paket ersetzen. Die CSS-Adressen enthalten ?v=3, damit Browser die neue Version abrufen. Falls nötig mit Strg+F5 neu laden. Bei einer lokal installierten TTF auch die Installation aktualisieren und die verwendete Anwendung neu starten. Der vollständige technische Zeichensatz steht in zeichensatz.json.</w:t>
       </w:r>
     </w:p>
     <w:sectPr>

</xml_diff>